<commit_message>
Add IPO support: /ipo command + README/docx
- .claude/commands/ipo.md: IPO application analysis (APPLY/SKIP/NEUTRAL), prospectus-driven,
  deep-dive discipline adapted to primary market; GMP explicitly excluded
- README + Drishti.docx: document /ipo and the primary-market data source

Data tool get_ipos (NSE public-issue feed) added to the nse-mcp connector on disk
(reference/NSE-MCP, untracked by design). Handles a blocked feed as UNKNOWN, not "no IPOs".
</commit_message>
<xml_diff>
--- a/Drishti.docx
+++ b/Drishti.docx
@@ -167,7 +167,6 @@
       <w:tblPr>
         <w:tblStyle w:val="TableGrid"/>
         <w:tblW w:type="auto" w:w="0"/>
-        <w:jc w:val="left"/>
         <w:tblLook w:firstColumn="1" w:firstRow="1" w:lastColumn="0" w:lastRow="0" w:noHBand="0" w:noVBand="1" w:val="04A0"/>
       </w:tblPr>
       <w:tblGrid>
@@ -469,7 +468,6 @@
       <w:tblPr>
         <w:tblStyle w:val="TableGrid"/>
         <w:tblW w:type="auto" w:w="0"/>
-        <w:jc w:val="left"/>
         <w:tblLook w:firstColumn="1" w:firstRow="1" w:lastColumn="0" w:lastRow="0" w:noHBand="0" w:noVBand="1" w:val="04A0"/>
       </w:tblPr>
       <w:tblGrid>
@@ -800,6 +798,47 @@
             <w:r/>
             <w:r>
               <w:t>Rated companies</w:t>
+            </w:r>
+          </w:p>
+        </w:tc>
+      </w:tr>
+      <w:tr>
+        <w:tc>
+          <w:tcPr>
+            <w:tcW w:type="dxa" w:w="2880"/>
+          </w:tcPr>
+          <w:p>
+            <w:r/>
+            <w:r>
+              <w:t>IPOs (primary market)</w:t>
+            </w:r>
+          </w:p>
+        </w:tc>
+        <w:tc>
+          <w:tcPr>
+            <w:tcW w:type="dxa" w:w="2880"/>
+          </w:tcPr>
+          <w:p>
+            <w:r/>
+            <w:r>
+              <w:t xml:space="preserve">Open and upcoming public issues with their particulars, and the prospectus (DRHP/RHP) read in full for </w:t>
+            </w:r>
+            <w:r>
+              <w:rPr>
+                <w:rFonts w:ascii="Consolas" w:hAnsi="Consolas"/>
+              </w:rPr>
+              <w:t>/ipo</w:t>
+            </w:r>
+          </w:p>
+        </w:tc>
+        <w:tc>
+          <w:tcPr>
+            <w:tcW w:type="dxa" w:w="2880"/>
+          </w:tcPr>
+          <w:p>
+            <w:r/>
+            <w:r>
+              <w:t>NSE public-issue feed + the offer document filed with SEBI/the exchanges</w:t>
             </w:r>
           </w:p>
         </w:tc>
@@ -1740,6 +1779,99 @@
         <w:pStyle w:val="Heading3"/>
       </w:pPr>
       <w:r>
+        <w:t>/ipo &lt;name&gt; — IPO application analysis</w:t>
+      </w:r>
+    </w:p>
+    <w:p>
+      <w:r>
+        <w:rPr>
+          <w:b/>
+        </w:rPr>
+        <w:t>Cost: high. Scope: one public issue.</w:t>
+      </w:r>
+    </w:p>
+    <w:p>
+      <w:r>
+        <w:t xml:space="preserve">The primary-market cousin of </w:t>
+      </w:r>
+      <w:r>
+        <w:rPr>
+          <w:rFonts w:ascii="Consolas" w:hAnsi="Consolas"/>
+        </w:rPr>
+        <w:t>/deep-dive</w:t>
+      </w:r>
+      <w:r>
+        <w:t xml:space="preserve">: the same discipline applied to a company that isn't listed yet, so there's no price history — the analysis rests on the </w:t>
+      </w:r>
+      <w:r>
+        <w:rPr>
+          <w:b/>
+        </w:rPr>
+        <w:t>prospectus</w:t>
+      </w:r>
+      <w:r>
+        <w:t xml:space="preserve"> (the DRHP / RHP offer document), read in full. It covers what the company does, the issue (how much is fresh money for the company versus existing holders cashing out), what the money will be used for, the restated financials, the asking valuation against listed peers, whether promoters or private-equity backers are exiting into the issue, and the risk factors — ending in an </w:t>
+      </w:r>
+      <w:r>
+        <w:rPr>
+          <w:b/>
+        </w:rPr>
+        <w:t>APPLY / SKIP / NEUTRAL</w:t>
+      </w:r>
+      <w:r>
+        <w:t xml:space="preserve"> call with the single biggest risk named.</w:t>
+      </w:r>
+    </w:p>
+    <w:p>
+      <w:r>
+        <w:t xml:space="preserve">Grey-market premium (GMP) is deliberately </w:t>
+      </w:r>
+      <w:r>
+        <w:rPr>
+          <w:b/>
+        </w:rPr>
+        <w:t>not</w:t>
+      </w:r>
+      <w:r>
+        <w:t xml:space="preserve"> used — it is unofficial, unregulated, and easily manipulated, the same category of noise the tool excludes everywhere else.</w:t>
+      </w:r>
+    </w:p>
+    <w:p>
+      <w:r>
+        <w:rPr>
+          <w:b/>
+        </w:rPr>
+        <w:t>Run it when:</w:t>
+      </w:r>
+      <w:r>
+        <w:t xml:space="preserve"> an IPO is open or upcoming and you're deciding whether to apply.</w:t>
+      </w:r>
+    </w:p>
+    <w:p>
+      <w:r>
+        <w:rPr>
+          <w:b/>
+        </w:rPr>
+        <w:t>Example:</w:t>
+      </w:r>
+    </w:p>
+    <w:p>
+      <w:pPr>
+        <w:ind w:left="432"/>
+      </w:pPr>
+      <w:r>
+        <w:rPr>
+          <w:rFonts w:ascii="Consolas" w:hAnsi="Consolas"/>
+          <w:sz w:val="20"/>
+        </w:rPr>
+        <w:t>/ipo &lt;company name&gt;</w:t>
+      </w:r>
+    </w:p>
+    <w:p>
+      <w:pPr>
+        <w:pStyle w:val="Heading3"/>
+      </w:pPr>
+      <w:r>
         <w:t>/port-patterns — adapt external research patterns</w:t>
       </w:r>
     </w:p>
@@ -2401,6 +2533,7 @@
       <w:rFonts w:asciiTheme="majorHAnsi" w:eastAsiaTheme="majorEastAsia" w:hAnsiTheme="majorHAnsi" w:cstheme="majorBidi" w:ascii="Calibri" w:hAnsi="Calibri"/>
       <w:b/>
       <w:bCs/>
+      <w:color w:val="365F91" w:themeColor="accent1" w:themeShade="BF"/>
       <w:sz w:val="32"/>
       <w:szCs w:val="28"/>
     </w:rPr>
@@ -2424,6 +2557,7 @@
       <w:rFonts w:asciiTheme="majorHAnsi" w:eastAsiaTheme="majorEastAsia" w:hAnsiTheme="majorHAnsi" w:cstheme="majorBidi" w:ascii="Calibri" w:hAnsi="Calibri"/>
       <w:b/>
       <w:bCs/>
+      <w:color w:val="4F81BD" w:themeColor="accent1"/>
       <w:sz w:val="28"/>
       <w:szCs w:val="26"/>
     </w:rPr>
@@ -2447,6 +2581,7 @@
       <w:rFonts w:asciiTheme="majorHAnsi" w:eastAsiaTheme="majorEastAsia" w:hAnsiTheme="majorHAnsi" w:cstheme="majorBidi" w:ascii="Calibri" w:hAnsi="Calibri"/>
       <w:b/>
       <w:bCs/>
+      <w:color w:val="4F81BD" w:themeColor="accent1"/>
       <w:sz w:val="24"/>
     </w:rPr>
   </w:style>

</xml_diff>

<commit_message>
Regenerate Drishti.docx with /macro + US rows
</commit_message>
<xml_diff>
--- a/Drishti.docx
+++ b/Drishti.docx
@@ -851,6 +851,94 @@
           <w:p>
             <w:r/>
             <w:r>
+              <w:t>Market regime</w:t>
+            </w:r>
+          </w:p>
+        </w:tc>
+        <w:tc>
+          <w:tcPr>
+            <w:tcW w:type="dxa" w:w="2880"/>
+          </w:tcPr>
+          <w:p>
+            <w:r/>
+            <w:r>
+              <w:t xml:space="preserve">Macro backdrop, derivatives smart-money positioning (participant open interest), sector rotation, cycle phase — for </w:t>
+            </w:r>
+            <w:r>
+              <w:rPr>
+                <w:rFonts w:ascii="Consolas" w:hAnsi="Consolas"/>
+              </w:rPr>
+              <w:t>/macro</w:t>
+            </w:r>
+            <w:r>
+              <w:t xml:space="preserve"> and entry timing</w:t>
+            </w:r>
+          </w:p>
+        </w:tc>
+        <w:tc>
+          <w:tcPr>
+            <w:tcW w:type="dxa" w:w="2880"/>
+          </w:tcPr>
+          <w:p>
+            <w:r/>
+            <w:r>
+              <w:t>Yahoo Finance (macro, sectors) + NSE participant-OI archive</w:t>
+            </w:r>
+          </w:p>
+        </w:tc>
+      </w:tr>
+      <w:tr>
+        <w:tc>
+          <w:tcPr>
+            <w:tcW w:type="dxa" w:w="2880"/>
+          </w:tcPr>
+          <w:p>
+            <w:r/>
+            <w:r>
+              <w:t>US equities</w:t>
+            </w:r>
+          </w:p>
+        </w:tc>
+        <w:tc>
+          <w:tcPr>
+            <w:tcW w:type="dxa" w:w="2880"/>
+          </w:tcPr>
+          <w:p>
+            <w:r/>
+            <w:r>
+              <w:t xml:space="preserve">Live US quotes, restated annual financials, and filings (10-K/10-Q, 8-K, insider Form 4) for </w:t>
+            </w:r>
+            <w:r>
+              <w:rPr>
+                <w:rFonts w:ascii="Consolas" w:hAnsi="Consolas"/>
+              </w:rPr>
+              <w:t>/deep-dive</w:t>
+            </w:r>
+            <w:r>
+              <w:t xml:space="preserve"> on US names</w:t>
+            </w:r>
+          </w:p>
+        </w:tc>
+        <w:tc>
+          <w:tcPr>
+            <w:tcW w:type="dxa" w:w="2880"/>
+          </w:tcPr>
+          <w:p>
+            <w:r/>
+            <w:r>
+              <w:t>Yahoo Finance + SEC EDGAR</w:t>
+            </w:r>
+          </w:p>
+        </w:tc>
+      </w:tr>
+      <w:tr>
+        <w:tc>
+          <w:tcPr>
+            <w:tcW w:type="dxa" w:w="2880"/>
+          </w:tcPr>
+          <w:p>
+            <w:r/>
+            <w:r>
               <w:t>News</w:t>
             </w:r>
           </w:p>
@@ -1243,6 +1331,85 @@
           <w:sz w:val="20"/>
         </w:rPr>
         <w:t xml:space="preserve">  /screen cement companies benefiting from the infrastructure capex cycle</w:t>
+      </w:r>
+    </w:p>
+    <w:p>
+      <w:pPr>
+        <w:pStyle w:val="Heading3"/>
+      </w:pPr>
+      <w:r>
+        <w:t>/macro — market regime read</w:t>
+      </w:r>
+    </w:p>
+    <w:p>
+      <w:r>
+        <w:rPr>
+          <w:b/>
+        </w:rPr>
+        <w:t>Cost: moderate. Scope: the whole market, not one name.</w:t>
+      </w:r>
+    </w:p>
+    <w:p>
+      <w:r>
+        <w:t xml:space="preserve">The top-down context command. Pulls the macro backdrop (dollar index, US yields, crude, India VIX), the derivatives </w:t>
+      </w:r>
+      <w:r>
+        <w:rPr>
+          <w:b/>
+        </w:rPr>
+        <w:t>smart-money positioning</w:t>
+      </w:r>
+      <w:r>
+        <w:t xml:space="preserve"> (are foreign institutions and prop desks positioned with or against retail), and </w:t>
+      </w:r>
+      <w:r>
+        <w:rPr>
+          <w:b/>
+        </w:rPr>
+        <w:t>sector rotation</w:t>
+      </w:r>
+      <w:r>
+        <w:t xml:space="preserve"> (which sectors are leading or rotating in) — then places them on the economic cycle and the Indian seasonal calendar to give a </w:t>
+      </w:r>
+      <w:r>
+        <w:rPr>
+          <w:b/>
+        </w:rPr>
+        <w:t>risk-on / neutral / risk-off</w:t>
+      </w:r>
+      <w:r>
+        <w:t xml:space="preserve"> read. Use it to time entries: a name can pass on its own merits but still warrant waiting if the regime is hostile.</w:t>
+      </w:r>
+    </w:p>
+    <w:p>
+      <w:r>
+        <w:rPr>
+          <w:b/>
+        </w:rPr>
+        <w:t>Run it when:</w:t>
+      </w:r>
+      <w:r>
+        <w:t xml:space="preserve"> starting a session, or before committing capital, to know which way the tape leans and which sectors to favour.</w:t>
+      </w:r>
+    </w:p>
+    <w:p>
+      <w:r>
+        <w:rPr>
+          <w:b/>
+        </w:rPr>
+        <w:t>Example:</w:t>
+      </w:r>
+    </w:p>
+    <w:p>
+      <w:pPr>
+        <w:ind w:left="432"/>
+      </w:pPr>
+      <w:r>
+        <w:rPr>
+          <w:rFonts w:ascii="Consolas" w:hAnsi="Consolas"/>
+          <w:sz w:val="20"/>
+        </w:rPr>
+        <w:t>/macro</w:t>
       </w:r>
     </w:p>
     <w:p>

</xml_diff>

<commit_message>
Docs: detailed update — Kite read-only, optional config, setup/architecture
- README §7 rewritten: Zerodha Kite is available + read-only (never trades), not 'planned'
- new §8 Optional configuration (watchlist, news, private investor profile) — nothing required
- new §9 Setup and architecture (install.sh, drishti-mcp + nse-mcp)
- workflow funnel now includes /macro and /ipo
- scripts/build_docx.py committed so Drishti.docx is reproducible (no more lost generator)
- Drishti.docx regenerated to match
</commit_message>
<xml_diff>
--- a/Drishti.docx
+++ b/Drishti.docx
@@ -2072,6 +2072,26 @@
           <w:rFonts w:ascii="Consolas" w:hAnsi="Consolas"/>
           <w:sz w:val="20"/>
         </w:rPr>
+        <w:t>/macro                    the tape: risk-on / neutral / risk-off, sectors leading</w:t>
+      </w:r>
+      <w:r>
+        <w:br/>
+      </w:r>
+      <w:r>
+        <w:rPr>
+          <w:rFonts w:ascii="Consolas" w:hAnsi="Consolas"/>
+          <w:sz w:val="20"/>
+        </w:rPr>
+        <w:t xml:space="preserve">      |</w:t>
+      </w:r>
+      <w:r>
+        <w:br/>
+      </w:r>
+      <w:r>
+        <w:rPr>
+          <w:rFonts w:ascii="Consolas" w:hAnsi="Consolas"/>
+          <w:sz w:val="20"/>
+        </w:rPr>
         <w:t>/brief                    daily: what changed today</w:t>
       </w:r>
       <w:r>
@@ -2112,7 +2132,7 @@
           <w:rFonts w:ascii="Consolas" w:hAnsi="Consolas"/>
           <w:sz w:val="20"/>
         </w:rPr>
-        <w:t>/deep-dive &lt;name&gt;         the full file on one name</w:t>
+        <w:t>/deep-dive &lt;name&gt;         the full file on one name        ( /ipo &lt;name&gt; for a public issue )</w:t>
       </w:r>
       <w:r>
         <w:br/>
@@ -2185,7 +2205,7 @@
         <w:pStyle w:val="Heading2"/>
       </w:pPr>
       <w:r>
-        <w:t>7. Planned: personal portfolio integration (Zerodha)</w:t>
+        <w:t>7. Portfolio context (Zerodha Kite) — optional, read-only</w:t>
       </w:r>
     </w:p>
     <w:p>
@@ -2193,12 +2213,10 @@
         <w:rPr>
           <w:b/>
         </w:rPr>
-        <w:t>Status: scoped, not yet connected.</w:t>
+        <w:t>Status: available, opt-in.</w:t>
       </w:r>
-    </w:p>
-    <w:p>
       <w:r>
-        <w:t>A connection to Zerodha's Kite platform is planned so that the tool can read your own actual holdings and profit/loss — for your own positions only, never as a data source for researching other companies. Once connected, the intended scope is:</w:t>
+        <w:t xml:space="preserve"> If you connect Zerodha's Kite, the tool can read your own holdings, positions, average entry price, profit/loss, and available margin — and use them to ground two commands:</w:t>
       </w:r>
     </w:p>
     <w:p>
@@ -2206,16 +2224,22 @@
         <w:pStyle w:val="ListBullet"/>
       </w:pPr>
       <w:r>
-        <w:t xml:space="preserve">Seeing your actual holdings and their entry price alongside </w:t>
-      </w:r>
-      <w:r>
         <w:rPr>
           <w:rFonts w:ascii="Consolas" w:hAnsi="Consolas"/>
         </w:rPr>
         <w:t>/exit</w:t>
       </w:r>
       <w:r>
-        <w:t xml:space="preserve"> checks, so the exit discipline is checked against what you genuinely hold rather than a logged note.</w:t>
+        <w:t xml:space="preserve"> tests its triggers against what you </w:t>
+      </w:r>
+      <w:r>
+        <w:rPr>
+          <w:b/>
+        </w:rPr>
+        <w:t>actually</w:t>
+      </w:r>
+      <w:r>
+        <w:t xml:space="preserve"> hold and your real cost basis, instead of a logged note.</w:t>
       </w:r>
     </w:p>
     <w:p>
@@ -2223,30 +2247,336 @@
         <w:pStyle w:val="ListBullet"/>
       </w:pPr>
       <w:r>
-        <w:t xml:space="preserve">Cross-referencing your own position sizes against the sizing that </w:t>
-      </w:r>
-      <w:r>
         <w:rPr>
           <w:rFonts w:ascii="Consolas" w:hAnsi="Consolas"/>
         </w:rPr>
         <w:t>/entry</w:t>
       </w:r>
       <w:r>
-        <w:t xml:space="preserve"> recommends.</w:t>
-      </w:r>
-    </w:p>
-    <w:p>
-      <w:r>
-        <w:t xml:space="preserve">This integration is </w:t>
+        <w:t xml:space="preserve"> sizes the risk gate against your </w:t>
       </w:r>
       <w:r>
         <w:rPr>
           <w:b/>
         </w:rPr>
-        <w:t>read-only by design</w:t>
+        <w:t>real</w:t>
       </w:r>
       <w:r>
-        <w:t xml:space="preserve"> — it is for visibility into your own book, not for placing trades. No trade-execution capability is planned. This document will be updated once the connection is active and in daily use.</w:t>
+        <w:t xml:space="preserve"> capital and existing exposure, and flags a name you already own.</w:t>
+      </w:r>
+    </w:p>
+    <w:p>
+      <w:r>
+        <w:rPr>
+          <w:b/>
+        </w:rPr>
+        <w:t>Read-only, and permanently so.</w:t>
+      </w:r>
+      <w:r>
+        <w:t xml:space="preserve"> Drishti never places, changes, or cancels an order, and never moves money — even though the Kite connector technically can. It structures the decision; you place every trade yourself in your broker. Kite is entirely optional: if it isn't connected, every command works normally without portfolio context.</w:t>
+      </w:r>
+    </w:p>
+    <w:p>
+      <w:pPr>
+        <w:pStyle w:val="Heading2"/>
+      </w:pPr>
+      <w:r>
+        <w:t>8. Optional configuration — nothing is required</w:t>
+      </w:r>
+    </w:p>
+    <w:p>
+      <w:r>
+        <w:t>Drishti runs out of the box with sensible defaults. Customize only what you want; each lives in a plain file the commands read if present:</w:t>
+      </w:r>
+    </w:p>
+    <w:tbl>
+      <w:tblPr>
+        <w:tblStyle w:val="TableGrid"/>
+        <w:tblW w:type="auto" w:w="0"/>
+        <w:tblLook w:firstColumn="1" w:firstRow="1" w:lastColumn="0" w:lastRow="0" w:noHBand="0" w:noVBand="1" w:val="04A0"/>
+      </w:tblPr>
+      <w:tblGrid>
+        <w:gridCol w:w="2880"/>
+        <w:gridCol w:w="2880"/>
+        <w:gridCol w:w="2880"/>
+      </w:tblGrid>
+      <w:tr>
+        <w:tc>
+          <w:tcPr>
+            <w:tcW w:type="dxa" w:w="2880"/>
+            <w:shd w:val="clear" w:fill="F2F2F2"/>
+          </w:tcPr>
+          <w:p>
+            <w:r/>
+            <w:r>
+              <w:rPr>
+                <w:b/>
+              </w:rPr>
+              <w:t>File</w:t>
+            </w:r>
+          </w:p>
+        </w:tc>
+        <w:tc>
+          <w:tcPr>
+            <w:tcW w:type="dxa" w:w="2880"/>
+            <w:shd w:val="clear" w:fill="F2F2F2"/>
+          </w:tcPr>
+          <w:p>
+            <w:r/>
+            <w:r>
+              <w:rPr>
+                <w:b/>
+              </w:rPr>
+              <w:t>What it controls</w:t>
+            </w:r>
+          </w:p>
+        </w:tc>
+        <w:tc>
+          <w:tcPr>
+            <w:tcW w:type="dxa" w:w="2880"/>
+            <w:shd w:val="clear" w:fill="F2F2F2"/>
+          </w:tcPr>
+          <w:p>
+            <w:r/>
+            <w:r>
+              <w:rPr>
+                <w:b/>
+              </w:rPr>
+              <w:t>Default</w:t>
+            </w:r>
+          </w:p>
+        </w:tc>
+      </w:tr>
+      <w:tr>
+        <w:tc>
+          <w:tcPr>
+            <w:tcW w:type="dxa" w:w="2880"/>
+          </w:tcPr>
+          <w:p>
+            <w:r/>
+            <w:r>
+              <w:rPr>
+                <w:rFonts w:ascii="Consolas" w:hAnsi="Consolas"/>
+              </w:rPr>
+              <w:t>config/watchlist.md</w:t>
+            </w:r>
+          </w:p>
+        </w:tc>
+        <w:tc>
+          <w:tcPr>
+            <w:tcW w:type="dxa" w:w="2880"/>
+          </w:tcPr>
+          <w:p>
+            <w:r/>
+            <w:r>
+              <w:t xml:space="preserve">The names </w:t>
+            </w:r>
+            <w:r>
+              <w:rPr>
+                <w:rFonts w:ascii="Consolas" w:hAnsi="Consolas"/>
+              </w:rPr>
+              <w:t>/brief</w:t>
+            </w:r>
+            <w:r>
+              <w:t xml:space="preserve"> and </w:t>
+            </w:r>
+            <w:r>
+              <w:rPr>
+                <w:rFonts w:ascii="Consolas" w:hAnsi="Consolas"/>
+              </w:rPr>
+              <w:t>/screen</w:t>
+            </w:r>
+            <w:r>
+              <w:t xml:space="preserve"> scan</w:t>
+            </w:r>
+          </w:p>
+        </w:tc>
+        <w:tc>
+          <w:tcPr>
+            <w:tcW w:type="dxa" w:w="2880"/>
+          </w:tcPr>
+          <w:p>
+            <w:r/>
+            <w:r>
+              <w:t>A starter watchlist ships</w:t>
+            </w:r>
+          </w:p>
+        </w:tc>
+      </w:tr>
+      <w:tr>
+        <w:tc>
+          <w:tcPr>
+            <w:tcW w:type="dxa" w:w="2880"/>
+          </w:tcPr>
+          <w:p>
+            <w:r/>
+            <w:r>
+              <w:rPr>
+                <w:rFonts w:ascii="Consolas" w:hAnsi="Consolas"/>
+              </w:rPr>
+              <w:t>config/news-sources.md</w:t>
+            </w:r>
+          </w:p>
+        </w:tc>
+        <w:tc>
+          <w:tcPr>
+            <w:tcW w:type="dxa" w:w="2880"/>
+          </w:tcPr>
+          <w:p>
+            <w:r/>
+            <w:r>
+              <w:t>The tiered news whitelist</w:t>
+            </w:r>
+          </w:p>
+        </w:tc>
+        <w:tc>
+          <w:tcPr>
+            <w:tcW w:type="dxa" w:w="2880"/>
+          </w:tcPr>
+          <w:p>
+            <w:r/>
+            <w:r>
+              <w:t>Sensible tiers ship</w:t>
+            </w:r>
+          </w:p>
+        </w:tc>
+      </w:tr>
+      <w:tr>
+        <w:tc>
+          <w:tcPr>
+            <w:tcW w:type="dxa" w:w="2880"/>
+          </w:tcPr>
+          <w:p>
+            <w:r/>
+            <w:r>
+              <w:rPr>
+                <w:rFonts w:ascii="Consolas" w:hAnsi="Consolas"/>
+              </w:rPr>
+              <w:t>config/investor-profile.md</w:t>
+            </w:r>
+          </w:p>
+        </w:tc>
+        <w:tc>
+          <w:tcPr>
+            <w:tcW w:type="dxa" w:w="2880"/>
+          </w:tcPr>
+          <w:p>
+            <w:r/>
+            <w:r>
+              <w:t xml:space="preserve">Private personalization — risk appetite, horizon, max position size, deployable capital, sector preferences; shapes </w:t>
+            </w:r>
+            <w:r>
+              <w:rPr>
+                <w:rFonts w:ascii="Consolas" w:hAnsi="Consolas"/>
+              </w:rPr>
+              <w:t>/entry</w:t>
+            </w:r>
+            <w:r>
+              <w:t xml:space="preserve"> sizing and </w:t>
+            </w:r>
+            <w:r>
+              <w:rPr>
+                <w:rFonts w:ascii="Consolas" w:hAnsi="Consolas"/>
+              </w:rPr>
+              <w:t>/screen</w:t>
+            </w:r>
+            <w:r>
+              <w:t xml:space="preserve"> filtering</w:t>
+            </w:r>
+          </w:p>
+        </w:tc>
+        <w:tc>
+          <w:tcPr>
+            <w:tcW w:type="dxa" w:w="2880"/>
+          </w:tcPr>
+          <w:p>
+            <w:r/>
+            <w:r>
+              <w:t>Absent → generic behaviour</w:t>
+            </w:r>
+          </w:p>
+        </w:tc>
+      </w:tr>
+    </w:tbl>
+    <w:p/>
+    <w:p>
+      <w:r>
+        <w:t xml:space="preserve">The investor profile is </w:t>
+      </w:r>
+      <w:r>
+        <w:rPr>
+          <w:b/>
+        </w:rPr>
+        <w:t>private and gitignored</w:t>
+      </w:r>
+      <w:r>
+        <w:t xml:space="preserve"> — it is never committed, and the tool never echoes its raw contents back. Create it from </w:t>
+      </w:r>
+      <w:r>
+        <w:rPr>
+          <w:rFonts w:ascii="Consolas" w:hAnsi="Consolas"/>
+        </w:rPr>
+        <w:t>config/investor-profile.example.md</w:t>
+      </w:r>
+      <w:r>
+        <w:t xml:space="preserve"> (the installer offers to do this for you).</w:t>
+      </w:r>
+    </w:p>
+    <w:p>
+      <w:pPr>
+        <w:pStyle w:val="Heading2"/>
+      </w:pPr>
+      <w:r>
+        <w:t>9. Setup and architecture</w:t>
+      </w:r>
+    </w:p>
+    <w:p>
+      <w:r>
+        <w:rPr>
+          <w:b/>
+        </w:rPr>
+        <w:t>Setup</w:t>
+      </w:r>
+      <w:r>
+        <w:t xml:space="preserve"> is one script — see [SETUP.md](SETUP.md): clone, run </w:t>
+      </w:r>
+      <w:r>
+        <w:rPr>
+          <w:rFonts w:ascii="Consolas" w:hAnsi="Consolas"/>
+        </w:rPr>
+        <w:t>./install.sh</w:t>
+      </w:r>
+      <w:r>
+        <w:t xml:space="preserve"> (it checks prerequisites, builds the tools, and writes the connection config for your machine), then open the folder in Claude Code. No API keys are needed — the data sources are public.</w:t>
+      </w:r>
+    </w:p>
+    <w:p>
+      <w:r>
+        <w:rPr>
+          <w:b/>
+        </w:rPr>
+        <w:t>Under the hood</w:t>
+      </w:r>
+      <w:r>
+        <w:t xml:space="preserve">, the tools are provided by two Model Context Protocol (MCP) servers: </w:t>
+      </w:r>
+      <w:r>
+        <w:rPr>
+          <w:rFonts w:ascii="Consolas" w:hAnsi="Consolas"/>
+        </w:rPr>
+        <w:t>drishti-mcp</w:t>
+      </w:r>
+      <w:r>
+        <w:t xml:space="preserve"> (this project's own — fundamentals, BSE filings, IPOs, macro regime, participant open interest, sector rotation, US filings) and </w:t>
+      </w:r>
+      <w:r>
+        <w:rPr>
+          <w:rFonts w:ascii="Consolas" w:hAnsi="Consolas"/>
+        </w:rPr>
+        <w:t>nse-mcp</w:t>
+      </w:r>
+      <w:r>
+        <w:t xml:space="preserve"> (a third-party connector for base NSE market data). You don't interact with these directly — the commands do.</w:t>
       </w:r>
     </w:p>
     <w:p>

</xml_diff>